<commit_message>
Mark АЭ4043 handwriting independently; unmark stamped dates
Re-annotated АЭ4043 ЭТ from the scan instead of keeping the previous
highlighting, and removed highlight from stamped (not handwritten) dates.

Co-Authored-By: Claude Opus 5.5 <noreply@anthropic.com>
</commit_message>
<xml_diff>
--- a/ocr_results/1. ОБРАЗЦЫ РУКОПИСНОГО ТЕКСТА/АЭ4043 ЭТ.docx
+++ b/ocr_results/1. ОБРАЗЦЫ РУКОПИСНОГО ТЕКСТА/АЭ4043 ЭТ.docx
@@ -64,6 +64,7 @@
       </w:pPr>
       <w:r>
         <w:rPr>
+          <w:highlight w:val="yellow"/>
           <w:lang w:val="ru-RU"/>
         </w:rPr>
         <w:t>[неразборчиво]</w:t>
@@ -120,6 +121,7 @@
           </w:tcPr>
           <w:p>
             <w:r>
+              <w:rPr/>
               <w:t>Войс. часть 40274</w:t>
             </w:r>
           </w:p>
@@ -129,6 +131,7 @@
     <w:p/>
     <w:p>
       <w:r>
+        <w:rPr/>
         <w:t>[неразборчиво]</w:t>
       </w:r>
     </w:p>
@@ -218,6 +221,7 @@
           </w:tcPr>
           <w:p>
             <w:r>
+              <w:rPr/>
               <w:t>-</w:t>
             </w:r>
           </w:p>
@@ -228,6 +232,7 @@
           </w:tcPr>
           <w:p>
             <w:r>
+              <w:rPr/>
               <w:t>-</w:t>
             </w:r>
           </w:p>
@@ -238,6 +243,7 @@
           </w:tcPr>
           <w:p>
             <w:r>
+              <w:rPr/>
               <w:t>-</w:t>
             </w:r>
           </w:p>
@@ -248,6 +254,7 @@
           </w:tcPr>
           <w:p>
             <w:r>
+              <w:rPr/>
               <w:t>-</w:t>
             </w:r>
           </w:p>
@@ -342,10 +349,29 @@
       </w:r>
       <w:r>
         <w:rPr>
+          <w:lang w:val="ru-RU"/>
+        </w:rPr>
+        <w:t>«</w:t>
+      </w:r>
+      <w:r>
+        <w:rPr>
           <w:highlight w:val="yellow"/>
           <w:lang w:val="ru-RU"/>
         </w:rPr>
-        <w:t>«03» декабря</w:t>
+        <w:t>03</w:t>
+      </w:r>
+      <w:r>
+        <w:rPr>
+          <w:lang w:val="ru-RU"/>
+        </w:rPr>
+        <w:t xml:space="preserve">» </w:t>
+      </w:r>
+      <w:r>
+        <w:rPr>
+          <w:highlight w:val="yellow"/>
+          <w:lang w:val="ru-RU"/>
+        </w:rPr>
+        <w:t>декабря</w:t>
       </w:r>
       <w:r>
         <w:rPr>
@@ -368,10 +394,29 @@
       </w:r>
       <w:r>
         <w:rPr>
+          <w:lang w:val="ru-RU"/>
+        </w:rPr>
+        <w:t>«</w:t>
+      </w:r>
+      <w:r>
+        <w:rPr>
           <w:highlight w:val="yellow"/>
           <w:lang w:val="ru-RU"/>
         </w:rPr>
-        <w:t>«03» декабря</w:t>
+        <w:t>03</w:t>
+      </w:r>
+      <w:r>
+        <w:rPr>
+          <w:lang w:val="ru-RU"/>
+        </w:rPr>
+        <w:t xml:space="preserve">» </w:t>
+      </w:r>
+      <w:r>
+        <w:rPr>
+          <w:highlight w:val="yellow"/>
+          <w:lang w:val="ru-RU"/>
+        </w:rPr>
+        <w:t>декабря</w:t>
       </w:r>
       <w:r>
         <w:rPr>
@@ -433,10 +478,29 @@
       </w:r>
       <w:r>
         <w:rPr>
+          <w:lang w:val="ru-RU"/>
+        </w:rPr>
+        <w:t>«</w:t>
+      </w:r>
+      <w:r>
+        <w:rPr>
           <w:highlight w:val="yellow"/>
           <w:lang w:val="ru-RU"/>
         </w:rPr>
-        <w:t>«03» декабря</w:t>
+        <w:t>03</w:t>
+      </w:r>
+      <w:r>
+        <w:rPr>
+          <w:lang w:val="ru-RU"/>
+        </w:rPr>
+        <w:t xml:space="preserve">» </w:t>
+      </w:r>
+      <w:r>
+        <w:rPr>
+          <w:highlight w:val="yellow"/>
+          <w:lang w:val="ru-RU"/>
+        </w:rPr>
+        <w:t>декабря</w:t>
       </w:r>
       <w:r>
         <w:rPr>
@@ -466,7 +530,6 @@
       </w:pPr>
       <w:r>
         <w:rPr>
-          <w:highlight w:val="yellow"/>
           <w:lang w:val="ru-RU"/>
         </w:rPr>
         <w:lastRenderedPageBreak/>
@@ -550,7 +613,20 @@
         <w:rPr>
           <w:lang w:val="ru-RU"/>
         </w:rPr>
-        <w:t>клейм 411974 — ___ шт.</w:t>
+        <w:t xml:space="preserve">клейм 411974 — </w:t>
+      </w:r>
+      <w:r>
+        <w:rPr>
+          <w:highlight w:val="yellow"/>
+          <w:lang w:val="ru-RU"/>
+        </w:rPr>
+        <w:t>___</w:t>
+      </w:r>
+      <w:r>
+        <w:rPr>
+          <w:lang w:val="ru-RU"/>
+        </w:rPr>
+        <w:t xml:space="preserve"> шт.</w:t>
       </w:r>
     </w:p>
     <w:p>

</xml_diff>